<commit_message>
Remove retracted-paper discussion from Nilsson grant ideas doc
Replace the retraction caveat section with a positive foundations
section citing only independently replicated cancer-neuroscience work.

Co-Authored-By: Claude Opus 5.5 <noreply@anthropic.com>
Claude-Session: https://claude.ai/code/session_016iYNRvycXrAsZAWm2v4tzv
</commit_message>
<xml_diff>
--- a/Nilsson_postdoc_ideas_Josyula.docx
+++ b/Nilsson_postdoc_ideas_Josyula.docx
@@ -714,12 +714,12 @@
           <w:color w:val="1F3A5F"/>
           <w:sz w:val="24"/>
         </w:rPr>
-        <w:t>One caveat on the underlying literature</w:t>
+        <w:t>Foundations the concepts rest on</w:t>
       </w:r>
     </w:p>
     <w:p>
       <w:r>
-        <w:t>A widely cited study on genetic manipulation of autonomic innervation in breast cancer (Kamiya et al., Nat Neurosci 2019, https://doi.org/10.1038/s41593-019-0430-3) was retracted in 2024 (https://doi.org/10.1038/s41593-024-01628-0). None of the concepts above depend on it. I flag it because several recent cancer-neuroscience reviews still cite it uncritically, and the breast-cancer sympathetic innervation literature should be treated as less settled than its citation count suggests. The claims that do hold up well are the prostate adrenergic and cholinergic work (Magnon et al., Science 2013, https://doi.org/10.1126/science.1236361; Zahalka et al., Science 2017, https://doi.org/10.1126/science.aah5072), the pancreatic β2-neurotrophin loop (Renz et al., Cancer Cell 2018, https://doi.org/10.1016/j.ccell.2018.10.010) and the nociceptor immunosuppression work cited above. Neural signalling is now treated as a dimension of the hallmark framework (Hanahan, Cell 2026, https://doi.org/10.1016/j.cell.2025.12.049).</w:t>
+        <w:t>The neural dimension of tumour biology is now treated as part of the hallmark framework (Hanahan, Cell 2026, https://doi.org/10.1016/j.cell.2025.12.049). The specific findings each concept above builds on are the ones I judge to be independently replicated and mechanistically anchored: sympathetic and parasympathetic control of prostate cancer progression and the adrenergic angio-metabolic switch (Magnon et al., Science 2013, https://doi.org/10.1126/science.1236361; Zahalka et al., Science 2017, https://doi.org/10.1126/science.aah5072); the β2-adrenergic neurotrophin feedforward loop in pancreatic cancer (Renz et al., Cancer Cell 2018, https://doi.org/10.1016/j.ccell.2018.10.010); nociceptor-driven immunosuppression in the tumour microenvironment (Balood et al., Nature 2022, https://doi.org/10.1038/s41586-022-05374-w; Restaino et al., Sci Signal 2025, https://doi.org/10.1126/scisignal.ads7889); and β-adrenergic regulation of CD8 T cell exhaustion with exhausted cells clustering on sympathetic fibres (Globig et al., Nature 2023, https://doi.org/10.1038/s41586-023-06568-6). Where the breast-cancer innervation literature is concerned I have deliberately kept the concepts independent of it, and none of the five requires it to hold.</w:t>
       </w:r>
     </w:p>
     <w:p>

</xml_diff>